<commit_message>
backup after JEB submission and Pangaea data submission
</commit_message>
<xml_diff>
--- a/writing_monaco/Plan Monaco_jan26.docx
+++ b/writing_monaco/Plan Monaco_jan26.docx
@@ -502,13 +502,15 @@
     <w:p>
       <w:pPr>
         <w:rPr>
-          <w:sz w:val="40"/>
-          <w:szCs w:val="40"/>
-          <w:lang w:val="is-IS"/>
-        </w:rPr>
-      </w:pPr>
-      <w:r>
-        <w:rPr>
+          <w:color w:val="4EA72E" w:themeColor="accent6"/>
+          <w:sz w:val="40"/>
+          <w:szCs w:val="40"/>
+          <w:lang w:val="is-IS"/>
+        </w:rPr>
+      </w:pPr>
+      <w:r>
+        <w:rPr>
+          <w:color w:val="4EA72E" w:themeColor="accent6"/>
           <w:sz w:val="40"/>
           <w:szCs w:val="40"/>
           <w:lang w:val="is-IS"/>
@@ -517,6 +519,7 @@
       </w:r>
       <w:r>
         <w:rPr>
+          <w:color w:val="4EA72E" w:themeColor="accent6"/>
           <w:sz w:val="40"/>
           <w:szCs w:val="40"/>
           <w:lang w:val="is-IS"/>
@@ -525,6 +528,7 @@
       </w:r>
       <w:r>
         <w:rPr>
+          <w:color w:val="4EA72E" w:themeColor="accent6"/>
           <w:sz w:val="40"/>
           <w:szCs w:val="40"/>
           <w:lang w:val="is-IS"/>
@@ -533,6 +537,7 @@
       </w:r>
       <w:r>
         <w:rPr>
+          <w:color w:val="4EA72E" w:themeColor="accent6"/>
           <w:sz w:val="40"/>
           <w:szCs w:val="40"/>
           <w:lang w:val="is-IS"/>
@@ -541,6 +546,7 @@
       </w:r>
       <w:r>
         <w:rPr>
+          <w:color w:val="4EA72E" w:themeColor="accent6"/>
           <w:sz w:val="40"/>
           <w:szCs w:val="40"/>
           <w:lang w:val="is-IS"/>
@@ -551,13 +557,15 @@
     <w:p>
       <w:pPr>
         <w:rPr>
-          <w:sz w:val="40"/>
-          <w:szCs w:val="40"/>
-          <w:lang w:val="is-IS"/>
-        </w:rPr>
-      </w:pPr>
-      <w:r>
-        <w:rPr>
+          <w:color w:val="4EA72E" w:themeColor="accent6"/>
+          <w:sz w:val="40"/>
+          <w:szCs w:val="40"/>
+          <w:lang w:val="is-IS"/>
+        </w:rPr>
+      </w:pPr>
+      <w:r>
+        <w:rPr>
+          <w:color w:val="4EA72E" w:themeColor="accent6"/>
           <w:sz w:val="40"/>
           <w:szCs w:val="40"/>
           <w:lang w:val="is-IS"/>
@@ -569,13 +577,15 @@
     <w:p>
       <w:pPr>
         <w:rPr>
-          <w:sz w:val="40"/>
-          <w:szCs w:val="40"/>
-          <w:lang w:val="is-IS"/>
-        </w:rPr>
-      </w:pPr>
-      <w:r>
-        <w:rPr>
+          <w:color w:val="4EA72E" w:themeColor="accent6"/>
+          <w:sz w:val="40"/>
+          <w:szCs w:val="40"/>
+          <w:lang w:val="is-IS"/>
+        </w:rPr>
+      </w:pPr>
+      <w:r>
+        <w:rPr>
+          <w:color w:val="4EA72E" w:themeColor="accent6"/>
           <w:sz w:val="40"/>
           <w:szCs w:val="40"/>
           <w:lang w:val="is-IS"/>
@@ -584,6 +594,7 @@
       </w:r>
       <w:r>
         <w:rPr>
+          <w:color w:val="4EA72E" w:themeColor="accent6"/>
           <w:sz w:val="40"/>
           <w:szCs w:val="40"/>
           <w:lang w:val="is-IS"/>
@@ -592,6 +603,7 @@
       </w:r>
       <w:r>
         <w:rPr>
+          <w:color w:val="4EA72E" w:themeColor="accent6"/>
           <w:sz w:val="40"/>
           <w:szCs w:val="40"/>
           <w:lang w:val="is-IS"/>
@@ -600,6 +612,7 @@
       </w:r>
       <w:r>
         <w:rPr>
+          <w:color w:val="4EA72E" w:themeColor="accent6"/>
           <w:sz w:val="40"/>
           <w:szCs w:val="40"/>
           <w:lang w:val="is-IS"/>
@@ -608,6 +621,7 @@
       </w:r>
       <w:r>
         <w:rPr>
+          <w:color w:val="4EA72E" w:themeColor="accent6"/>
           <w:sz w:val="40"/>
           <w:szCs w:val="40"/>
           <w:lang w:val="is-IS"/>
@@ -616,6 +630,7 @@
       </w:r>
       <w:r>
         <w:rPr>
+          <w:color w:val="4EA72E" w:themeColor="accent6"/>
           <w:sz w:val="40"/>
           <w:szCs w:val="40"/>
           <w:lang w:val="is-IS"/>
@@ -626,11 +641,40 @@
     <w:p>
       <w:pPr>
         <w:rPr>
-          <w:sz w:val="40"/>
-          <w:szCs w:val="40"/>
-          <w:lang w:val="is-IS"/>
-        </w:rPr>
-      </w:pPr>
+          <w:color w:val="4EA72E" w:themeColor="accent6"/>
+          <w:sz w:val="40"/>
+          <w:szCs w:val="40"/>
+          <w:lang w:val="is-IS"/>
+        </w:rPr>
+      </w:pPr>
+      <w:r>
+        <w:rPr>
+          <w:color w:val="4EA72E" w:themeColor="accent6"/>
+          <w:sz w:val="40"/>
+          <w:szCs w:val="40"/>
+          <w:lang w:val="is-IS"/>
+        </w:rPr>
+        <w:t>Write abstract by end of Tuesday 14th April and Send to Sam</w:t>
+      </w:r>
+    </w:p>
+    <w:p>
+      <w:pPr>
+        <w:rPr>
+          <w:color w:val="4EA72E" w:themeColor="accent6"/>
+          <w:sz w:val="40"/>
+          <w:szCs w:val="40"/>
+          <w:lang w:val="is-IS"/>
+        </w:rPr>
+      </w:pPr>
+      <w:r>
+        <w:rPr>
+          <w:color w:val="4EA72E" w:themeColor="accent6"/>
+          <w:sz w:val="40"/>
+          <w:szCs w:val="40"/>
+          <w:lang w:val="is-IS"/>
+        </w:rPr>
+        <w:t xml:space="preserve">Make a JEB formatted version of the manuscript by the end of Monday 13th. </w:t>
+      </w:r>
     </w:p>
     <w:p>
       <w:pPr>

</xml_diff>